<commit_message>
Reduce deletion log retention to 7 days
</commit_message>
<xml_diff>
--- a/docs/bot-dpo-ib-functional-description.docx
+++ b/docs/bot-dpo-ib-functional-description.docx
@@ -6108,7 +6108,7 @@
           <w:rFonts w:ascii="Arial" w:hAnsi="Arial"/>
           <w:sz w:val="20"/>
         </w:rPr>
-        <w:t>deletion_log: автоматическая очистка не реализована;</w:t>
+        <w:t>deletion_log: автоматическая очистка записей старше DELETION_LOG_RETENTION_DAYS, дефолт 7 дней;</w:t>
       </w:r>
     </w:p>
     <w:p>
@@ -6153,7 +6153,7 @@
           <w:rFonts w:ascii="Arial" w:hAnsi="Arial"/>
           <w:sz w:val="20"/>
         </w:rPr>
-        <w:t>Рекомендация для согласования: определить бизнес-срок хранения deletion_log, Registration и managed_chats, а также порядок удаления данных по запросу субъекта или при закрытии процесса.</w:t>
+        <w:t>Рекомендация для согласования: периодически пересматривать бизнес-срок хранения deletion_log, а также определить сроки для Registration и managed_chats и порядок удаления данных по запросу субъекта или при закрытии процесса.</w:t>
       </w:r>
     </w:p>
     <w:p>
@@ -6488,7 +6488,7 @@
                 <w:b w:val="0"/>
                 <w:sz w:val="18"/>
               </w:rPr>
-              <w:t>deletion_log не имеет автоочистки</w:t>
+              <w:t>Настройка retention может быть изменена</w:t>
             </w:r>
           </w:p>
         </w:tc>
@@ -6508,7 +6508,7 @@
                 <w:b w:val="0"/>
                 <w:sz w:val="18"/>
               </w:rPr>
-              <w:t>Согласовать срок хранения и при необходимости добавить scheduled cleanup</w:t>
+              <w:t>Контролировать DELETION_LOG_RETENTION_DAYS; текущий срок 7 дней</w:t>
             </w:r>
           </w:p>
         </w:tc>

</xml_diff>

<commit_message>
Fix polling watchdog conflict
</commit_message>
<xml_diff>
--- a/docs/bot-dpo-ib-functional-description.docx
+++ b/docs/bot-dpo-ib-functional-description.docx
@@ -563,7 +563,7 @@
                 <w:b w:val="0"/>
                 <w:sz w:val="18"/>
               </w:rPr>
-              <w:t>Проверка polling через getUpdates и рестарт контейнера при сбое</w:t>
+              <w:t>Безопасная проверка Telegram API через getMe и рестарт контейнера при сбое</w:t>
             </w:r>
           </w:p>
         </w:tc>
@@ -4661,7 +4661,7 @@
           <w:rFonts w:ascii="Arial" w:hAnsi="Arial"/>
           <w:sz w:val="20"/>
         </w:rPr>
-        <w:t>Скрипт вызывает Telegram getUpdates?timeout=10 из контейнера.</w:t>
+        <w:t>Скрипт вызывает безопасный Telegram-метод getMe из контейнера.</w:t>
       </w:r>
     </w:p>
     <w:p>
@@ -4673,7 +4673,7 @@
           <w:rFonts w:ascii="Arial" w:hAnsi="Arial"/>
           <w:sz w:val="20"/>
         </w:rPr>
-        <w:t>Если Telegram возвращает 409 Conflict, значит основной polling уже удерживается ботом и работает корректно.</w:t>
+        <w:t>Успешный ответ ok=true подтверждает доступность Telegram API и валидность токена.</w:t>
       </w:r>
     </w:p>
     <w:p>
@@ -4685,7 +4685,7 @@
           <w:rFonts w:ascii="Arial" w:hAnsi="Arial"/>
           <w:sz w:val="20"/>
         </w:rPr>
-        <w:t>Если 409 Conflict не получен, счетчик ошибок увеличивается.</w:t>
+        <w:t>Проверка не вызывает getUpdates, не конфликтует с polling и не забирает пользовательские обновления.</w:t>
       </w:r>
     </w:p>
     <w:p>

</xml_diff>

<commit_message>
Prevent bot hangs on external I/O
</commit_message>
<xml_diff>
--- a/docs/bot-dpo-ib-functional-description.docx
+++ b/docs/bot-dpo-ib-functional-description.docx
@@ -395,7 +395,7 @@
                 <w:b w:val="0"/>
                 <w:sz w:val="18"/>
               </w:rPr>
-              <w:t>Чтение HR-таблиц и запись регистраций</w:t>
+              <w:t>Чтение HR-таблиц и запись регистраций через worker thread с HTTP timeout</w:t>
             </w:r>
           </w:p>
         </w:tc>
@@ -437,7 +437,7 @@
                 <w:b w:val="0"/>
                 <w:sz w:val="18"/>
               </w:rPr>
-              <w:t>Отправка OTP-кода на корпоративную почту</w:t>
+              <w:t>Отправка OTP-кода через worker thread, без блокировки event loop</w:t>
             </w:r>
           </w:p>
         </w:tc>
@@ -563,7 +563,7 @@
                 <w:b w:val="0"/>
                 <w:sz w:val="18"/>
               </w:rPr>
-              <w:t>Безопасная проверка Telegram API через getMe и рестарт контейнера при сбое</w:t>
+              <w:t>Проверка heartbeat и Telegram API через getMe, рестарт контейнера при зависании</w:t>
             </w:r>
           </w:p>
         </w:tc>
@@ -4661,7 +4661,7 @@
           <w:rFonts w:ascii="Arial" w:hAnsi="Arial"/>
           <w:sz w:val="20"/>
         </w:rPr>
-        <w:t>Скрипт вызывает безопасный Telegram-метод getMe из контейнера.</w:t>
+        <w:t>Event loop бота каждую минуту атомарно обновляет data/bot_heartbeat.</w:t>
       </w:r>
     </w:p>
     <w:p>
@@ -4673,7 +4673,7 @@
           <w:rFonts w:ascii="Arial" w:hAnsi="Arial"/>
           <w:sz w:val="20"/>
         </w:rPr>
-        <w:t>Успешный ответ ok=true подтверждает доступность Telegram API и валидность токена.</w:t>
+        <w:t>Watchdog проверяет возраст heartbeat и сразу перезапускает контейнер, если heartbeat старше 3 минут.</w:t>
       </w:r>
     </w:p>
     <w:p>
@@ -4685,7 +4685,7 @@
           <w:rFonts w:ascii="Arial" w:hAnsi="Arial"/>
           <w:sz w:val="20"/>
         </w:rPr>
-        <w:t>Проверка не вызывает getUpdates, не конфликтует с polling и не забирает пользовательские обновления.</w:t>
+        <w:t>При свежем heartbeat watchdog вызывает getMe; проверка не вызывает getUpdates и не конфликтует с polling.</w:t>
       </w:r>
     </w:p>
     <w:p>
@@ -4697,7 +4697,7 @@
           <w:rFonts w:ascii="Arial" w:hAnsi="Arial"/>
           <w:sz w:val="20"/>
         </w:rPr>
-        <w:t>После 3 последовательных неуспешных проверок выполняется docker compose restart bot.</w:t>
+        <w:t>После 3 последовательных ошибок Telegram API выполняется docker compose restart bot.</w:t>
       </w:r>
     </w:p>
     <w:p>
@@ -5670,7 +5670,7 @@
           <w:rFonts w:ascii="Arial" w:hAnsi="Arial"/>
           <w:sz w:val="20"/>
         </w:rPr>
-        <w:t>отдельный watchdog проверяет polling и перезапускает контейнер при сбое.</w:t>
+        <w:t>watchdog контролирует heartbeat event loop и Telegram API, перезапуская контейнер при зависании; синхронные Google Sheets и SMTP-операции вынесены из Telegram event loop.</w:t>
       </w:r>
     </w:p>
     <w:p>

</xml_diff>